<commit_message>
Implement paragraph style read/write and styles.xml handling in XWPF
</commit_message>
<xml_diff>
--- a/tests/DotnetPoi.Interop.Tests/fixtures/from-dotnet-poi/phase-docx-comprehensive.docx
+++ b/tests/DotnetPoi.Interop.Tests/fixtures/from-dotnet-poi/phase-docx-comprehensive.docx
@@ -90,7 +90,7 @@
       </w:r>
     </w:p>
     <w:p>
-      <w:hyperlink r:id="rId2" w:history="1">
+      <w:hyperlink r:id="rId3" w:history="1">
         <w:r>
           <w:t xml:space="preserve">Click here for DotnetPoi</w:t>
         </w:r>
@@ -161,7 +161,7 @@
         </w:tc>
         <w:tc>
           <w:p>
-            <w:hyperlink r:id="rId3" w:history="1">
+            <w:hyperlink r:id="rId4" w:history="1">
               <w:r>
                 <w:t xml:space="preserve">Example</w:t>
               </w:r>
@@ -236,4 +236,118 @@
     <w:abstractNumId w:val="1"/>
   </w:num>
 </w:numbering>
+</file>
+
+<file path=word/styles.xml><?xml version="1.0" encoding="utf-8"?>
+<w:styles xmlns:w="http://schemas.openxmlformats.org/wordprocessingml/2006/main" xmlns:r="http://schemas.openxmlformats.org/officeDocument/2006/relationships">
+  <w:docDefaults>
+    <w:rPrDefault>
+      <w:rPr>
+        <w:sz w:val="22"/>
+        <w:szCs w:val="22"/>
+      </w:rPr>
+    </w:rPrDefault>
+    <w:pPrDefault>
+      <w:pPr>
+        <w:spacing w:after="200" w:line="276" w:lineRule="auto"/>
+      </w:pPr>
+    </w:pPrDefault>
+  </w:docDefaults>
+  <w:latentStyles w:defLockedState="0" w:defUIPriority="99" w:defSemiHidden="1" w:defUnhideWhenUsed="1" w:defQFormat="0" w:count="267">
+    <w:lsdException w:name="Normal" w:semiHidden="0" w:uiPriority="0" w:unhideWhenUsed="0" w:qFormat="1"/>
+    <w:lsdException w:name="heading 1" w:semiHidden="0" w:uiPriority="9" w:unhideWhenUsed="0" w:qFormat="1"/>
+    <w:lsdException w:name="heading 2" w:uiPriority="9" w:qFormat="1"/>
+    <w:lsdException w:name="heading 3" w:uiPriority="9" w:qFormat="1"/>
+    <w:lsdException w:name="heading 4" w:uiPriority="9"/>
+    <w:lsdException w:name="heading 5" w:uiPriority="9"/>
+    <w:lsdException w:name="heading 6" w:uiPriority="9"/>
+    <w:lsdException w:name="heading 7" w:uiPriority="9"/>
+    <w:lsdException w:name="heading 8" w:uiPriority="9"/>
+    <w:lsdException w:name="heading 9" w:uiPriority="9"/>
+    <w:lsdException w:name="Title" w:semiHidden="0" w:uiPriority="10"/>
+    <w:lsdException w:name="Subtitle" w:semiHidden="0" w:uiPriority="11"/>
+    <w:lsdException w:name="Strong" w:uiPriority="22" w:qFormat="1"/>
+    <w:lsdException w:name="Emphasis" w:uiPriority="20" w:qFormat="1"/>
+    <w:lsdException w:name="No Spacing" w:semiHidden="0" w:uiPriority="1" w:qFormat="1"/>
+    <w:lsdException w:name="List Paragraph" w:uiPriority="34" w:qFormat="1"/>
+    <w:lsdException w:name="Quote" w:uiPriority="29" w:qFormat="1"/>
+    <w:lsdException w:name="Intense Quote" w:uiPriority="30" w:qFormat="1"/>
+    <w:lsdException w:name="Subtle Emphasis" w:uiPriority="19" w:qFormat="1"/>
+    <w:lsdException w:name="Intense Emphasis" w:uiPriority="21" w:qFormat="1"/>
+    <w:lsdException w:name="Subtle Reference" w:uiPriority="31" w:qFormat="1"/>
+    <w:lsdException w:name="Intense Reference" w:uiPriority="32" w:qFormat="1"/>
+  </w:latentStyles>
+  <w:style w:type="paragraph" w:styleId="Normal" w:default="1">
+    <w:name w:val="Normal"/>
+    <w:qFormat/>
+    <w:uiPriority w:val="0"/>
+    <w:semiHidden w:val="0"/>
+    <w:unhideWhenUsed w:val="0"/>
+    <w:rPr>
+      <w:sz w:val="24"/>
+      <w:szCs w:val="24"/>
+    </w:rPr>
+    <w:pPr>
+      <w:spacing w:after="0" w:line="240" w:lineRule="auto"/>
+    </w:pPr>
+  </w:style>
+  <w:style w:type="paragraph" w:styleId="heading 1">
+    <w:name w:val="Heading 1"/>
+    <w:basedOn w:val="Normal"/>
+    <w:next w:val="Normal"/>
+    <w:qFormat/>
+    <w:uiPriority w:val="9"/>
+    <w:rPr>
+      <w:b w:val="on"/>
+      <w:color w:val="2F5496" w:themeColor="accent1" w:themeShade="BF"/>
+      <w:sz w:val="32"/>
+      <w:szCs w:val="32"/>
+      <w:kern w:val="0"/>
+      <w:spacing w:val="0" w:csVal="0"/>
+    </w:rPr>
+    <w:pPr>
+      <w:spacing w:before="480" w:after="0"/>
+      <w:outlineLvl w:val="0"/>
+    </w:pPr>
+  </w:style>
+  <w:style w:type="paragraph" w:styleId="heading 2">
+    <w:name w:val="Heading 2"/>
+    <w:basedOn w:val="Normal"/>
+    <w:next w:val="Normal"/>
+    <w:qFormat/>
+    <w:uiPriority w:val="9"/>
+    <w:rPr>
+      <w:b w:val="on"/>
+      <w:i w:val="on"/>
+      <w:color w:val="2F5496" w:themeColor="accent1" w:themeShade="BF"/>
+      <w:sz w:val="28"/>
+      <w:szCs w:val="28"/>
+      <w:kern w:val="0"/>
+      <w:spacing w:val="0" w:csVal="0"/>
+    </w:rPr>
+    <w:pPr>
+      <w:spacing w:before="280" w:after="0"/>
+      <w:outlineLvl w:val="1"/>
+    </w:pPr>
+  </w:style>
+  <w:style w:type="paragraph" w:styleId="heading 3">
+    <w:name w:val="Heading 3"/>
+    <w:basedOn w:val="Normal"/>
+    <w:next w:val="Normal"/>
+    <w:qFormat/>
+    <w:uiPriority w:val="9"/>
+    <w:rPr>
+      <w:b w:val="on"/>
+      <w:color w:val="1F3864" w:themeColor="accent1" w:themeDark="25"/>
+      <w:sz w:val="24"/>
+      <w:szCs w:val="24"/>
+      <w:kern w:val="0"/>
+      <w:spacing w:val="0" w:csVal="0"/>
+    </w:rPr>
+    <w:pPr>
+      <w:spacing w:before="200" w:after="0"/>
+      <w:outlineLvl w:val="2"/>
+    </w:pPr>
+  </w:style>
+</w:styles>
 </file>
</xml_diff>

<commit_message>
Update example links to use the master branch and bump version to 0.5.0
</commit_message>
<xml_diff>
--- a/tests/DotnetPoi.Interop.Tests/fixtures/from-dotnet-poi/phase-docx-comprehensive.docx
+++ b/tests/DotnetPoi.Interop.Tests/fixtures/from-dotnet-poi/phase-docx-comprehensive.docx
@@ -180,8 +180,8 @@
     <w:sectPr>
       <w:pgSz w:w="15840" w:h="12240" w:orient="landscape"/>
       <w:pgMar w:top="720" w:right="720" w:bottom="720" w:left="720" w:header="720" w:footer="720"/>
-      <w:headerReference w:type="default" r:id="rId5"/>
-      <w:footerReference w:type="default" r:id="rId6"/>
+      <w:headerReference w:type="default" r:id="rId6"/>
+      <w:footerReference w:type="default" r:id="rId7"/>
     </w:sectPr>
   </w:body>
 </w:document>

</xml_diff>